<commit_message>
Draft of object Oriented Code
</commit_message>
<xml_diff>
--- a/SafetyDocumentA2-2.docx
+++ b/SafetyDocumentA2-2.docx
@@ -511,10 +511,7 @@
             </w:r>
             <w:proofErr w:type="gramEnd"/>
             <w:r>
-              <w:t>.</w:t>
-            </w:r>
-            <w:r>
-              <w:t xml:space="preserve"> </w:t>
+              <w:t xml:space="preserve">. </w:t>
             </w:r>
             <w:r>
               <w:t>An</w:t>
@@ -4466,7 +4463,19 @@
               <w:rPr>
                 <w:b/>
               </w:rPr>
-              <w:t>4/09/2026</w:t>
+              <w:t>/</w:t>
+            </w:r>
+            <w:r>
+              <w:rPr>
+                <w:b/>
+              </w:rPr>
+              <w:t>10</w:t>
+            </w:r>
+            <w:r>
+              <w:rPr>
+                <w:b/>
+              </w:rPr>
+              <w:t>/2026</w:t>
             </w:r>
           </w:p>
           <w:p>
@@ -11694,26 +11703,6 @@
 </file>
 
 <file path=customXml/item2.xml><?xml version="1.0" encoding="utf-8"?>
-<?mso-contentType ?>
-<FormTemplates xmlns="http://schemas.microsoft.com/sharepoint/v3/contenttype/forms">
-  <Display>DocumentLibraryForm</Display>
-  <Edit>DocumentLibraryForm</Edit>
-  <New>DocumentLibraryForm</New>
-</FormTemplates>
-</file>
-
-<file path=customXml/item3.xml><?xml version="1.0" encoding="utf-8"?>
-<p:properties xmlns:p="http://schemas.microsoft.com/office/2006/metadata/properties" xmlns:xsi="http://www.w3.org/2001/XMLSchema-instance" xmlns:pc="http://schemas.microsoft.com/office/infopath/2007/PartnerControls">
-  <documentManagement>
-    <lcf76f155ced4ddcb4097134ff3c332f xmlns="194b5157-fd69-48bf-8799-6801f682fdaa">
-      <Terms xmlns="http://schemas.microsoft.com/office/infopath/2007/PartnerControls"/>
-    </lcf76f155ced4ddcb4097134ff3c332f>
-    <TaxCatchAll xmlns="8b46e80d-813a-4d62-85f4-3425941ac432" xsi:nil="true"/>
-  </documentManagement>
-</p:properties>
-</file>
-
-<file path=customXml/item4.xml><?xml version="1.0" encoding="utf-8"?>
 <ct:contentTypeSchema xmlns:ct="http://schemas.microsoft.com/office/2006/metadata/contentType" xmlns:ma="http://schemas.microsoft.com/office/2006/metadata/properties/metaAttributes" ct:_="" ma:_="" ma:contentTypeName="Document" ma:contentTypeID="0x010100AA59F834A397E54B92E3206891BD4539" ma:contentTypeVersion="16" ma:contentTypeDescription="Create a new document." ma:contentTypeScope="" ma:versionID="abf03173208a7ee6dac6ecb80d58dd0c">
   <xsd:schema xmlns:xsd="http://www.w3.org/2001/XMLSchema" xmlns:xs="http://www.w3.org/2001/XMLSchema" xmlns:p="http://schemas.microsoft.com/office/2006/metadata/properties" xmlns:ns2="194b5157-fd69-48bf-8799-6801f682fdaa" xmlns:ns3="8b46e80d-813a-4d62-85f4-3425941ac432" targetNamespace="http://schemas.microsoft.com/office/2006/metadata/properties" ma:root="true" ma:fieldsID="67d7094a08e2316c7b534ac121162a89" ns2:_="" ns3:_="">
     <xsd:import namespace="194b5157-fd69-48bf-8799-6801f682fdaa"/>
@@ -11954,6 +11943,26 @@
 </ct:contentTypeSchema>
 </file>
 
+<file path=customXml/item3.xml><?xml version="1.0" encoding="utf-8"?>
+<p:properties xmlns:p="http://schemas.microsoft.com/office/2006/metadata/properties" xmlns:xsi="http://www.w3.org/2001/XMLSchema-instance" xmlns:pc="http://schemas.microsoft.com/office/infopath/2007/PartnerControls">
+  <documentManagement>
+    <lcf76f155ced4ddcb4097134ff3c332f xmlns="194b5157-fd69-48bf-8799-6801f682fdaa">
+      <Terms xmlns="http://schemas.microsoft.com/office/infopath/2007/PartnerControls"/>
+    </lcf76f155ced4ddcb4097134ff3c332f>
+    <TaxCatchAll xmlns="8b46e80d-813a-4d62-85f4-3425941ac432" xsi:nil="true"/>
+  </documentManagement>
+</p:properties>
+</file>
+
+<file path=customXml/item4.xml><?xml version="1.0" encoding="utf-8"?>
+<?mso-contentType ?>
+<FormTemplates xmlns="http://schemas.microsoft.com/sharepoint/v3/contenttype/forms">
+  <Display>DocumentLibraryForm</Display>
+  <Edit>DocumentLibraryForm</Edit>
+  <New>DocumentLibraryForm</New>
+</FormTemplates>
+</file>
+
 <file path=customXml/itemProps1.xml><?xml version="1.0" encoding="utf-8"?>
 <ds:datastoreItem xmlns:ds="http://schemas.openxmlformats.org/officeDocument/2006/customXml" ds:itemID="{B4E36382-B49A-4F2B-8912-1ED2278F0D8B}">
   <ds:schemaRefs>
@@ -11963,9 +11972,20 @@
 </file>
 
 <file path=customXml/itemProps2.xml><?xml version="1.0" encoding="utf-8"?>
-<ds:datastoreItem xmlns:ds="http://schemas.openxmlformats.org/officeDocument/2006/customXml" ds:itemID="{241B9448-77C0-4B8C-B834-CB1245F6B261}">
+<ds:datastoreItem xmlns:ds="http://schemas.openxmlformats.org/officeDocument/2006/customXml" ds:itemID="{792B0214-8C46-486B-8E77-01908F6E56E2}">
   <ds:schemaRefs>
-    <ds:schemaRef ds:uri="http://schemas.microsoft.com/sharepoint/v3/contenttype/forms"/>
+    <ds:schemaRef ds:uri="http://schemas.microsoft.com/office/2006/metadata/contentType"/>
+    <ds:schemaRef ds:uri="http://schemas.microsoft.com/office/2006/metadata/properties/metaAttributes"/>
+    <ds:schemaRef ds:uri="http://www.w3.org/2001/XMLSchema"/>
+    <ds:schemaRef ds:uri="http://schemas.microsoft.com/office/2006/metadata/properties"/>
+    <ds:schemaRef ds:uri="194b5157-fd69-48bf-8799-6801f682fdaa"/>
+    <ds:schemaRef ds:uri="8b46e80d-813a-4d62-85f4-3425941ac432"/>
+    <ds:schemaRef ds:uri="http://schemas.microsoft.com/office/2006/documentManagement/types"/>
+    <ds:schemaRef ds:uri="http://schemas.microsoft.com/office/infopath/2007/PartnerControls"/>
+    <ds:schemaRef ds:uri="http://schemas.openxmlformats.org/package/2006/metadata/core-properties"/>
+    <ds:schemaRef ds:uri="http://purl.org/dc/elements/1.1/"/>
+    <ds:schemaRef ds:uri="http://purl.org/dc/terms/"/>
+    <ds:schemaRef ds:uri="http://schemas.microsoft.com/internal/obd"/>
   </ds:schemaRefs>
 </ds:datastoreItem>
 </file>
@@ -11982,20 +12002,9 @@
 </file>
 
 <file path=customXml/itemProps4.xml><?xml version="1.0" encoding="utf-8"?>
-<ds:datastoreItem xmlns:ds="http://schemas.openxmlformats.org/officeDocument/2006/customXml" ds:itemID="{792B0214-8C46-486B-8E77-01908F6E56E2}">
+<ds:datastoreItem xmlns:ds="http://schemas.openxmlformats.org/officeDocument/2006/customXml" ds:itemID="{241B9448-77C0-4B8C-B834-CB1245F6B261}">
   <ds:schemaRefs>
-    <ds:schemaRef ds:uri="http://schemas.microsoft.com/office/2006/metadata/contentType"/>
-    <ds:schemaRef ds:uri="http://schemas.microsoft.com/office/2006/metadata/properties/metaAttributes"/>
-    <ds:schemaRef ds:uri="http://www.w3.org/2001/XMLSchema"/>
-    <ds:schemaRef ds:uri="http://schemas.microsoft.com/office/2006/metadata/properties"/>
-    <ds:schemaRef ds:uri="194b5157-fd69-48bf-8799-6801f682fdaa"/>
-    <ds:schemaRef ds:uri="8b46e80d-813a-4d62-85f4-3425941ac432"/>
-    <ds:schemaRef ds:uri="http://schemas.microsoft.com/office/2006/documentManagement/types"/>
-    <ds:schemaRef ds:uri="http://schemas.microsoft.com/office/infopath/2007/PartnerControls"/>
-    <ds:schemaRef ds:uri="http://schemas.openxmlformats.org/package/2006/metadata/core-properties"/>
-    <ds:schemaRef ds:uri="http://purl.org/dc/elements/1.1/"/>
-    <ds:schemaRef ds:uri="http://purl.org/dc/terms/"/>
-    <ds:schemaRef ds:uri="http://schemas.microsoft.com/internal/obd"/>
+    <ds:schemaRef ds:uri="http://schemas.microsoft.com/sharepoint/v3/contenttype/forms"/>
   </ds:schemaRefs>
 </ds:datastoreItem>
 </file>
</xml_diff>